<commit_message>
design/feedback-and-decisions: reframe as anecdote, not a study
- the problem came up in ordinary conversation with friends of group members, recalled by the group
- new section: how strong this evidence is (what it is / what it is not), so we never claim a survey
- the design itself came from the group discussion; the source column is left for the group to fill
- docx + pdf rebuilt (3 pages, figure in the appendix)
</commit_message>
<xml_diff>
--- a/mock-school-api/design/feedback-and-decisions.docx
+++ b/mock-school-api/design/feedback-and-decisions.docx
@@ -30,22 +30,27 @@
           <w:color w:val="024638"/>
           <w:sz w:val="25"/>
         </w:rPr>
-        <w:t>1. How the design was decided</w:t>
+        <w:t>1. How this started</w:t>
       </w:r>
     </w:p>
     <w:p>
       <w:r>
-        <w:t>Two sources decided this design.</w:t>
+        <w:t>The problem did not come from a survey. It came up in ordinary conversation.</w:t>
       </w:r>
     </w:p>
     <w:p>
       <w:r>
-        <w:t>First, a group discussion. We started from the Plan, which says the University timetable is an input we read rather than something we build. We asked what an outside service would have to provide for our system to work, and what we would need if we never got access to the real one.</w:t>
+        <w:t>Members of the group had heard the same complaint from friends outside the team, more than once and from different people: between two classes there is nowhere obvious to sit, the library is full, and nobody knows which classroom is free right now. Some also mentioned small things about the rooms themselves, such as whether there are sockets, or whether the seating suits group work.</w:t>
       </w:r>
     </w:p>
     <w:p>
       <w:r>
-        <w:t>Second, feedback from friends outside the group. We described the idea to a few people who are not on the team, and asked three questions: does this make sense, what would you worry about, and what would you want to see. Their comments are in the first table.</w:t>
+        <w:t>Those remarks are the reason we picked this problem. They are anecdotal: they tell us the problem exists among people we know, and they do not measure how common it is.</w:t>
+      </w:r>
+    </w:p>
+    <w:p>
+      <w:r>
+        <w:t>The design in the appendix then came from our own group discussion, starting from the Plan.</w:t>
       </w:r>
     </w:p>
     <w:p>
@@ -58,7 +63,7 @@
           <w:color w:val="024638"/>
           <w:sz w:val="25"/>
         </w:rPr>
-        <w:t>2. What our friends raised, and what we changed</w:t>
+        <w:t>2. What friends mentioned, in passing</w:t>
       </w:r>
     </w:p>
     <w:tbl>
@@ -92,7 +97,7 @@
         </w:tc>
         <w:tc>
           <w:tcPr>
-            <w:tcW w:type="dxa" w:w="1928"/>
+            <w:tcW w:type="dxa" w:w="2041"/>
           </w:tcPr>
           <w:p>
             <w:r/>
@@ -107,7 +112,7 @@
         </w:tc>
         <w:tc>
           <w:tcPr>
-            <w:tcW w:type="dxa" w:w="3628"/>
+            <w:tcW w:type="dxa" w:w="3515"/>
           </w:tcPr>
           <w:p>
             <w:r/>
@@ -116,7 +121,7 @@
                 <w:b/>
                 <w:sz w:val="18"/>
               </w:rPr>
-              <w:t>What they raised (in our words)</w:t>
+              <w:t>What they said (in our words)</w:t>
             </w:r>
           </w:p>
         </w:tc>
@@ -131,7 +136,7 @@
                 <w:b/>
                 <w:sz w:val="18"/>
               </w:rPr>
-              <w:t>What we changed</w:t>
+              <w:t>Where it shows up</w:t>
             </w:r>
           </w:p>
         </w:tc>
@@ -153,7 +158,7 @@
         </w:tc>
         <w:tc>
           <w:tcPr>
-            <w:tcW w:type="dxa" w:w="1928"/>
+            <w:tcW w:type="dxa" w:w="2041"/>
           </w:tcPr>
           <w:p>
             <w:r/>
@@ -161,13 +166,13 @@
               <w:rPr>
                 <w:sz w:val="17"/>
               </w:rPr>
-              <w:t>[friend, course]</w:t>
+              <w:t>[friend of which member]</w:t>
             </w:r>
           </w:p>
         </w:tc>
         <w:tc>
           <w:tcPr>
-            <w:tcW w:type="dxa" w:w="3628"/>
+            <w:tcW w:type="dxa" w:w="3515"/>
           </w:tcPr>
           <w:p>
             <w:r/>
@@ -211,7 +216,7 @@
         </w:tc>
         <w:tc>
           <w:tcPr>
-            <w:tcW w:type="dxa" w:w="1928"/>
+            <w:tcW w:type="dxa" w:w="2041"/>
           </w:tcPr>
           <w:p>
             <w:r/>
@@ -219,13 +224,13 @@
               <w:rPr>
                 <w:sz w:val="17"/>
               </w:rPr>
-              <w:t>[friend, course]</w:t>
+              <w:t>[ ]</w:t>
             </w:r>
           </w:p>
         </w:tc>
         <w:tc>
           <w:tcPr>
-            <w:tcW w:type="dxa" w:w="3628"/>
+            <w:tcW w:type="dxa" w:w="3515"/>
           </w:tcPr>
           <w:p>
             <w:r/>
@@ -269,7 +274,7 @@
         </w:tc>
         <w:tc>
           <w:tcPr>
-            <w:tcW w:type="dxa" w:w="1928"/>
+            <w:tcW w:type="dxa" w:w="2041"/>
           </w:tcPr>
           <w:p>
             <w:r/>
@@ -277,13 +282,13 @@
               <w:rPr>
                 <w:sz w:val="17"/>
               </w:rPr>
-              <w:t>[friend, course]</w:t>
+              <w:t>[ ]</w:t>
             </w:r>
           </w:p>
         </w:tc>
         <w:tc>
           <w:tcPr>
-            <w:tcW w:type="dxa" w:w="3628"/>
+            <w:tcW w:type="dxa" w:w="3515"/>
           </w:tcPr>
           <w:p>
             <w:r/>
@@ -327,7 +332,7 @@
         </w:tc>
         <w:tc>
           <w:tcPr>
-            <w:tcW w:type="dxa" w:w="1928"/>
+            <w:tcW w:type="dxa" w:w="2041"/>
           </w:tcPr>
           <w:p>
             <w:r/>
@@ -335,13 +340,13 @@
               <w:rPr>
                 <w:sz w:val="17"/>
               </w:rPr>
-              <w:t>[friend, course]</w:t>
+              <w:t>[ ]</w:t>
             </w:r>
           </w:p>
         </w:tc>
         <w:tc>
           <w:tcPr>
-            <w:tcW w:type="dxa" w:w="3628"/>
+            <w:tcW w:type="dxa" w:w="3515"/>
           </w:tcPr>
           <w:p>
             <w:r/>
@@ -379,12 +384,164 @@
           <w:color w:val="024638"/>
           <w:sz w:val="25"/>
         </w:rPr>
-        <w:t>3. Decisions, and who they came from</w:t>
+        <w:t>3. How strong this evidence is</w:t>
+      </w:r>
+    </w:p>
+    <w:tbl>
+      <w:tblPr>
+        <w:tblStyle w:val="LightGrid-Accent1"/>
+        <w:tblW w:type="auto" w:w="0"/>
+        <w:jc w:val="center"/>
+        <w:tblLook w:firstColumn="1" w:firstRow="1" w:lastColumn="0" w:lastRow="0" w:noHBand="0" w:noVBand="1" w:val="04A0"/>
+      </w:tblPr>
+      <w:tblGrid>
+        <w:gridCol w:w="4986"/>
+        <w:gridCol w:w="4986"/>
+      </w:tblGrid>
+      <w:tr>
+        <w:tc>
+          <w:tcPr>
+            <w:tcW w:type="dxa" w:w="4649"/>
+          </w:tcPr>
+          <w:p>
+            <w:r/>
+            <w:r>
+              <w:rPr>
+                <w:b/>
+                <w:sz w:val="18"/>
+              </w:rPr>
+              <w:t>What it is</w:t>
+            </w:r>
+          </w:p>
+        </w:tc>
+        <w:tc>
+          <w:tcPr>
+            <w:tcW w:type="dxa" w:w="4649"/>
+          </w:tcPr>
+          <w:p>
+            <w:r/>
+            <w:r>
+              <w:rPr>
+                <w:b/>
+                <w:sz w:val="18"/>
+              </w:rPr>
+              <w:t>What it is not</w:t>
+            </w:r>
+          </w:p>
+        </w:tc>
+      </w:tr>
+      <w:tr>
+        <w:tc>
+          <w:tcPr>
+            <w:tcW w:type="dxa" w:w="4649"/>
+          </w:tcPr>
+          <w:p>
+            <w:r/>
+            <w:r>
+              <w:rPr>
+                <w:sz w:val="17"/>
+              </w:rPr>
+              <w:t>Comments made in conversation, recalled by group members</w:t>
+            </w:r>
+          </w:p>
+        </w:tc>
+        <w:tc>
+          <w:tcPr>
+            <w:tcW w:type="dxa" w:w="4649"/>
+          </w:tcPr>
+          <w:p>
+            <w:r/>
+            <w:r>
+              <w:rPr>
+                <w:sz w:val="17"/>
+              </w:rPr>
+              <w:t>A survey, an interview study, or a measurement</w:t>
+            </w:r>
+          </w:p>
+        </w:tc>
+      </w:tr>
+      <w:tr>
+        <w:tc>
+          <w:tcPr>
+            <w:tcW w:type="dxa" w:w="4649"/>
+          </w:tcPr>
+          <w:p>
+            <w:r/>
+            <w:r>
+              <w:rPr>
+                <w:sz w:val="17"/>
+              </w:rPr>
+              <w:t>Evidence that the problem exists in our own circle</w:t>
+            </w:r>
+          </w:p>
+        </w:tc>
+        <w:tc>
+          <w:tcPr>
+            <w:tcW w:type="dxa" w:w="4649"/>
+          </w:tcPr>
+          <w:p>
+            <w:r/>
+            <w:r>
+              <w:rPr>
+                <w:sz w:val="17"/>
+              </w:rPr>
+              <w:t>Evidence of how common it is across HKU</w:t>
+            </w:r>
+          </w:p>
+        </w:tc>
+      </w:tr>
+      <w:tr>
+        <w:tc>
+          <w:tcPr>
+            <w:tcW w:type="dxa" w:w="4649"/>
+          </w:tcPr>
+          <w:p>
+            <w:r/>
+            <w:r>
+              <w:rPr>
+                <w:sz w:val="17"/>
+              </w:rPr>
+              <w:t>A reason to build the thing</w:t>
+            </w:r>
+          </w:p>
+        </w:tc>
+        <w:tc>
+          <w:tcPr>
+            <w:tcW w:type="dxa" w:w="4649"/>
+          </w:tcPr>
+          <w:p>
+            <w:r/>
+            <w:r>
+              <w:rPr>
+                <w:sz w:val="17"/>
+              </w:rPr>
+              <w:t>A result we can report</w:t>
+            </w:r>
+          </w:p>
+        </w:tc>
+      </w:tr>
+    </w:tbl>
+    <w:p>
+      <w:r>
+        <w:t>If the report needs a number, it has to come from the separate survey, not from this note. [confirm: which survey, and how many responses]</w:t>
+      </w:r>
+    </w:p>
+    <w:p>
+      <w:pPr>
+        <w:spacing w:before="180" w:after="60"/>
+      </w:pPr>
+      <w:r>
+        <w:rPr>
+          <w:b/>
+          <w:color w:val="024638"/>
+          <w:sz w:val="25"/>
+        </w:rPr>
+        <w:t>4. Decisions, and where they came from</w:t>
       </w:r>
     </w:p>
     <w:p>
       <w:r>
-        <w:t>Tick one source per row, then keep this table as an appendix.</w:t>
+        <w:t>The design was decided in group discussion. Write group in the last column, or friends, then group where a remark in section 2 prompted the row.</w:t>
       </w:r>
     </w:p>
     <w:tbl>
@@ -417,7 +574,7 @@
         </w:tc>
         <w:tc>
           <w:tcPr>
-            <w:tcW w:type="dxa" w:w="4082"/>
+            <w:tcW w:type="dxa" w:w="4195"/>
           </w:tcPr>
           <w:p>
             <w:r/>
@@ -432,7 +589,7 @@
         </w:tc>
         <w:tc>
           <w:tcPr>
-            <w:tcW w:type="dxa" w:w="2041"/>
+            <w:tcW w:type="dxa" w:w="1928"/>
           </w:tcPr>
           <w:p>
             <w:r/>
@@ -463,7 +620,7 @@
         </w:tc>
         <w:tc>
           <w:tcPr>
-            <w:tcW w:type="dxa" w:w="4082"/>
+            <w:tcW w:type="dxa" w:w="4195"/>
           </w:tcPr>
           <w:p>
             <w:r/>
@@ -477,7 +634,7 @@
         </w:tc>
         <w:tc>
           <w:tcPr>
-            <w:tcW w:type="dxa" w:w="2041"/>
+            <w:tcW w:type="dxa" w:w="1928"/>
           </w:tcPr>
           <w:p>
             <w:r/>
@@ -485,7 +642,7 @@
               <w:rPr>
                 <w:sz w:val="17"/>
               </w:rPr>
-              <w:t>[ group / friends ]</w:t>
+              <w:t>[ ]</w:t>
             </w:r>
           </w:p>
         </w:tc>
@@ -507,7 +664,7 @@
         </w:tc>
         <w:tc>
           <w:tcPr>
-            <w:tcW w:type="dxa" w:w="4082"/>
+            <w:tcW w:type="dxa" w:w="4195"/>
           </w:tcPr>
           <w:p>
             <w:r/>
@@ -521,7 +678,7 @@
         </w:tc>
         <w:tc>
           <w:tcPr>
-            <w:tcW w:type="dxa" w:w="2041"/>
+            <w:tcW w:type="dxa" w:w="1928"/>
           </w:tcPr>
           <w:p>
             <w:r/>
@@ -529,7 +686,7 @@
               <w:rPr>
                 <w:sz w:val="17"/>
               </w:rPr>
-              <w:t>[ group / friends ]</w:t>
+              <w:t>[ ]</w:t>
             </w:r>
           </w:p>
         </w:tc>
@@ -551,7 +708,7 @@
         </w:tc>
         <w:tc>
           <w:tcPr>
-            <w:tcW w:type="dxa" w:w="4082"/>
+            <w:tcW w:type="dxa" w:w="4195"/>
           </w:tcPr>
           <w:p>
             <w:r/>
@@ -565,7 +722,7 @@
         </w:tc>
         <w:tc>
           <w:tcPr>
-            <w:tcW w:type="dxa" w:w="2041"/>
+            <w:tcW w:type="dxa" w:w="1928"/>
           </w:tcPr>
           <w:p>
             <w:r/>
@@ -573,7 +730,7 @@
               <w:rPr>
                 <w:sz w:val="17"/>
               </w:rPr>
-              <w:t>[ group / friends ]</w:t>
+              <w:t>[ ]</w:t>
             </w:r>
           </w:p>
         </w:tc>
@@ -595,7 +752,7 @@
         </w:tc>
         <w:tc>
           <w:tcPr>
-            <w:tcW w:type="dxa" w:w="4082"/>
+            <w:tcW w:type="dxa" w:w="4195"/>
           </w:tcPr>
           <w:p>
             <w:r/>
@@ -603,13 +760,13 @@
               <w:rPr>
                 <w:sz w:val="17"/>
               </w:rPr>
-              <w:t>The timetable changes a few times a day, not every second; a cheap GET /v1/meta tells us if anything changed</w:t>
+              <w:t>The timetable changes a few times a day, not every second; a cheap GET /v1/meta tells us whether anything changed</w:t>
             </w:r>
           </w:p>
         </w:tc>
         <w:tc>
           <w:tcPr>
-            <w:tcW w:type="dxa" w:w="2041"/>
+            <w:tcW w:type="dxa" w:w="1928"/>
           </w:tcPr>
           <w:p>
             <w:r/>
@@ -617,7 +774,7 @@
               <w:rPr>
                 <w:sz w:val="17"/>
               </w:rPr>
-              <w:t>[ group / friends ]</w:t>
+              <w:t>[ ]</w:t>
             </w:r>
           </w:p>
         </w:tc>
@@ -639,7 +796,7 @@
         </w:tc>
         <w:tc>
           <w:tcPr>
-            <w:tcW w:type="dxa" w:w="4082"/>
+            <w:tcW w:type="dxa" w:w="4195"/>
           </w:tcPr>
           <w:p>
             <w:r/>
@@ -653,7 +810,7 @@
         </w:tc>
         <w:tc>
           <w:tcPr>
-            <w:tcW w:type="dxa" w:w="2041"/>
+            <w:tcW w:type="dxa" w:w="1928"/>
           </w:tcPr>
           <w:p>
             <w:r/>
@@ -661,7 +818,7 @@
               <w:rPr>
                 <w:sz w:val="17"/>
               </w:rPr>
-              <w:t>[ group / friends ]</w:t>
+              <w:t>[ ]</w:t>
             </w:r>
           </w:p>
         </w:tc>
@@ -683,7 +840,7 @@
         </w:tc>
         <w:tc>
           <w:tcPr>
-            <w:tcW w:type="dxa" w:w="4082"/>
+            <w:tcW w:type="dxa" w:w="4195"/>
           </w:tcPr>
           <w:p>
             <w:r/>
@@ -697,7 +854,7 @@
         </w:tc>
         <w:tc>
           <w:tcPr>
-            <w:tcW w:type="dxa" w:w="2041"/>
+            <w:tcW w:type="dxa" w:w="1928"/>
           </w:tcPr>
           <w:p>
             <w:r/>
@@ -705,7 +862,7 @@
               <w:rPr>
                 <w:sz w:val="17"/>
               </w:rPr>
-              <w:t>[ group / friends ]</w:t>
+              <w:t>[ ]</w:t>
             </w:r>
           </w:p>
         </w:tc>
@@ -727,7 +884,7 @@
         </w:tc>
         <w:tc>
           <w:tcPr>
-            <w:tcW w:type="dxa" w:w="4082"/>
+            <w:tcW w:type="dxa" w:w="4195"/>
           </w:tcPr>
           <w:p>
             <w:r/>
@@ -741,7 +898,7 @@
         </w:tc>
         <w:tc>
           <w:tcPr>
-            <w:tcW w:type="dxa" w:w="2041"/>
+            <w:tcW w:type="dxa" w:w="1928"/>
           </w:tcPr>
           <w:p>
             <w:r/>
@@ -749,7 +906,7 @@
               <w:rPr>
                 <w:sz w:val="17"/>
               </w:rPr>
-              <w:t>[ group / friends ]</w:t>
+              <w:t>[ ]</w:t>
             </w:r>
           </w:p>
         </w:tc>
@@ -771,7 +928,7 @@
         </w:tc>
         <w:tc>
           <w:tcPr>
-            <w:tcW w:type="dxa" w:w="4082"/>
+            <w:tcW w:type="dxa" w:w="4195"/>
           </w:tcPr>
           <w:p>
             <w:r/>
@@ -785,7 +942,7 @@
         </w:tc>
         <w:tc>
           <w:tcPr>
-            <w:tcW w:type="dxa" w:w="2041"/>
+            <w:tcW w:type="dxa" w:w="1928"/>
           </w:tcPr>
           <w:p>
             <w:r/>
@@ -793,7 +950,7 @@
               <w:rPr>
                 <w:sz w:val="17"/>
               </w:rPr>
-              <w:t>[ group / friends ]</w:t>
+              <w:t>[ ]</w:t>
             </w:r>
           </w:p>
         </w:tc>
@@ -815,7 +972,7 @@
         </w:tc>
         <w:tc>
           <w:tcPr>
-            <w:tcW w:type="dxa" w:w="4082"/>
+            <w:tcW w:type="dxa" w:w="4195"/>
           </w:tcPr>
           <w:p>
             <w:r/>
@@ -829,7 +986,7 @@
         </w:tc>
         <w:tc>
           <w:tcPr>
-            <w:tcW w:type="dxa" w:w="2041"/>
+            <w:tcW w:type="dxa" w:w="1928"/>
           </w:tcPr>
           <w:p>
             <w:r/>
@@ -837,7 +994,7 @@
               <w:rPr>
                 <w:sz w:val="17"/>
               </w:rPr>
-              <w:t>[ group / friends ]</w:t>
+              <w:t>[ ]</w:t>
             </w:r>
           </w:p>
         </w:tc>
@@ -853,7 +1010,7 @@
           <w:color w:val="024638"/>
           <w:sz w:val="25"/>
         </w:rPr>
-        <w:t>4. What we discussed and deliberately did not do</w:t>
+        <w:t>5. What we discussed and deliberately did not do</w:t>
       </w:r>
     </w:p>
     <w:p>
@@ -898,7 +1055,7 @@
           <w:color w:val="024638"/>
           <w:sz w:val="25"/>
         </w:rPr>
-        <w:t>5. What we know we cannot detect</w:t>
+        <w:t>6. What we know we cannot detect</w:t>
       </w:r>
     </w:p>
     <w:p>
@@ -916,7 +1073,7 @@
           <w:color w:val="024638"/>
           <w:sz w:val="25"/>
         </w:rPr>
-        <w:t>6. Who did what</w:t>
+        <w:t>7. Who did what</w:t>
       </w:r>
     </w:p>
     <w:tbl>
@@ -1180,7 +1337,7 @@
     </w:p>
     <w:p>
       <w:r>
-        <w:t>The architecture these decisions produce is in figures/two-systems-architecture-en.png. The reasoning is in design-log-2026-10-22.md.</w:t>
+        <w:t>The architecture is in figures/two-systems-architecture-en.png; the engineering reasoning is in design-log-2026-10-22.md.</w:t>
       </w:r>
     </w:p>
     <w:sectPr>

</xml_diff>